<commit_message>
build: bracket every citation consistently
Citations rendered two ways. A resolvable shortcut link like [Kalfon 2025] had its brackets
eaten by markdown -- "Foundation models Kalfon 2025 raise accuracy" -- while an
unresolvable multi-key one like [Abdelaal 2019, Fu 2024] stayed literal and kept them. Half
the citations in both PDFs had brackets and half did not.

Each resolvable key is now rewritten as an inline link whose text is the escaped bracketed
key, so every citation reads [Author Year] and stays clickable.

Restricted to keys ending in a year. The first version matched every link definition,
including the plumbing key [repo], which shattered the reference-style link [benchmark
repository][repo] into literal brackets plus a bare URL and produced a 157pt overfull line
-- 5.5 cm off the page. Worst overfull is back to 4.9pt in the full paper.
</commit_message>
<xml_diff>
--- a/manuscript/actinn-jax_brief.docx
+++ b/manuscript/actinn-jax_brief.docx
@@ -285,7 +285,7 @@
           <w:rPr>
             <w:rStyle w:val="Hyperlink"/>
           </w:rPr>
-          <w:t xml:space="preserve">Kalfon 2025</w:t>
+          <w:t xml:space="preserve">[Kalfon 2025]</w:t>
         </w:r>
       </w:hyperlink>
       <w:r>
@@ -326,7 +326,7 @@
           <w:rPr>
             <w:rStyle w:val="Hyperlink"/>
           </w:rPr>
-          <w:t xml:space="preserve">Sarkar et al. 2026</w:t>
+          <w:t xml:space="preserve">[Sarkar et al. 2026]</w:t>
         </w:r>
       </w:hyperlink>
       <w:r>
@@ -519,7 +519,7 @@
           <w:rPr>
             <w:rStyle w:val="Hyperlink"/>
           </w:rPr>
-          <w:t xml:space="preserve">Ma &amp; Pellegrini 2020</w:t>
+          <w:t xml:space="preserve">[Ma &amp; Pellegrini 2020]</w:t>
         </w:r>
       </w:hyperlink>
       <w:r>
@@ -760,7 +760,7 @@
           <w:rPr>
             <w:rStyle w:val="Hyperlink"/>
           </w:rPr>
-          <w:t xml:space="preserve">CZI Census 2025</w:t>
+          <w:t xml:space="preserve">[CZI Census 2025]</w:t>
         </w:r>
       </w:hyperlink>
       <w:r>
@@ -3437,7 +3437,7 @@
           <w:rPr>
             <w:rStyle w:val="Hyperlink"/>
           </w:rPr>
-          <w:t xml:space="preserve">Sarkar et al. 2026</w:t>
+          <w:t xml:space="preserve">[Sarkar et al. 2026]</w:t>
         </w:r>
       </w:hyperlink>
       <w:r>

</xml_diff>

<commit_message>
paper: promote the abstain figure to main text
§3.5's argument is about the shape of the confidence curve -- one method
tunable across its range, the other saturated so every threshold from 0.3 to 0.9
lands on a single operating point. That is the one thing a four-row threshold
table cannot show, and the figure was sitting in the supplement.

Now Figure 6, cited at the sentence that makes the claim. Figures 6 and 7 shift
to 7 and 8; the supplement loses S2 and renumbers S3-S5 to S2-S4, and both
papers' supplement pointers drop the abstain trade-off from what they promise.

All 17 main captions and 7 supplementary captions verified sequential, every
in-text reference re-checked. Overfull boxes unchanged at 8/4/8; preprint 28 pp,
supplement 6 pp, brief 8 pp.

Co-Authored-By: Claude Opus 5 <noreply@anthropic.com>
</commit_message>
<xml_diff>
--- a/manuscript/actinn-jax_brief.docx
+++ b/manuscript/actinn-jax_brief.docx
@@ -750,19 +750,19 @@
         <w:t xml:space="preserve"> </w:t>
       </w:r>
       <w:r>
-        <w:t xml:space="preserve">(separate document) contains Figures S1–S5 — confusion matrices</w:t>
-      </w:r>
-      <w:r>
-        <w:t xml:space="preserve"> </w:t>
-      </w:r>
-      <w:r>
-        <w:t xml:space="preserve">with ontology-equivalent errors outlined, the abstain trade-off, and per-class recall for</w:t>
-      </w:r>
-      <w:r>
-        <w:t xml:space="preserve"> </w:t>
-      </w:r>
-      <w:r>
-        <w:t xml:space="preserve">eleven methods on three splits — and Tables S1–S3.</w:t>
+        <w:t xml:space="preserve">(separate document) contains Figures S1–S4 — confusion matrices</w:t>
+      </w:r>
+      <w:r>
+        <w:t xml:space="preserve"> </w:t>
+      </w:r>
+      <w:r>
+        <w:t xml:space="preserve">with ontology-equivalent errors outlined, and per-class recall for eleven methods on three</w:t>
+      </w:r>
+      <w:r>
+        <w:t xml:space="preserve"> </w:t>
+      </w:r>
+      <w:r>
+        <w:t xml:space="preserve">splits — and Tables S1–S3.</w:t>
       </w:r>
     </w:p>
     <w:p>

</xml_diff>

<commit_message>
brief: add the cost-vs-accuracy panel as Figure 1
The brief opens by arguing that accuracy is clustered and cost is not, then
asked the reader to take that from a table of eleven rows. The figure that makes
the point now sits with it, and the workflow and agreement figures shift to 2
and 3.

Ten pages, still.

Co-Authored-By: Claude Opus 5 <noreply@anthropic.com>
</commit_message>
<xml_diff>
--- a/manuscript/actinn-jax_brief.docx
+++ b/manuscript/actinn-jax_brief.docx
@@ -979,7 +979,7 @@
       </w:r>
     </w:p>
     <w:bookmarkEnd w:id="15"/>
-    <w:bookmarkStart w:id="28" w:name="results"/>
+    <w:bookmarkStart w:id="31" w:name="results"/>
     <w:p>
       <w:pPr>
         <w:pStyle w:val="Heading1"/>
@@ -988,7 +988,7 @@
         <w:t xml:space="preserve">Results</w:t>
       </w:r>
     </w:p>
-    <w:bookmarkStart w:id="16" w:name="accuracy-is-clustered-cost-is-not"/>
+    <w:bookmarkStart w:id="19" w:name="accuracy-is-clustered-cost-is-not"/>
     <w:p>
       <w:pPr>
         <w:pStyle w:val="Heading2"/>
@@ -1021,7 +1021,7 @@
         <w:t xml:space="preserve"> </w:t>
       </w:r>
       <w:r>
-        <w:t xml:space="preserve">pipeline rather than by a deep model (Table 1). Those same four differ by</w:t>
+        <w:t xml:space="preserve">pipeline rather than by a deep model (Table 1; Figure 1 draws the whole panel at once). Those same four differ by</w:t>
       </w:r>
       <w:r>
         <w:t xml:space="preserve"> </w:t>
@@ -1083,6 +1083,182 @@
       </w:r>
       <w:r>
         <w:t xml:space="preserve">the best ontology-aware concordance (0.811), likewise a margin inside repeat noise.</w:t>
+      </w:r>
+    </w:p>
+    <w:p>
+      <w:pPr>
+        <w:pStyle w:val="BodyText"/>
+      </w:pPr>
+      <w:r>
+        <w:drawing>
+          <wp:inline>
+            <wp:extent cx="5334000" cy="2668748"/>
+            <wp:effectExtent b="0" l="0" r="0" t="0"/>
+            <wp:docPr descr="accuracy and cost across every split" title="" id="17" name="Picture"/>
+            <a:graphic>
+              <a:graphicData uri="http://schemas.openxmlformats.org/drawingml/2006/picture">
+                <pic:pic>
+                  <pic:nvPicPr>
+                    <pic:cNvPr descr="/Users/iandriver/Downloads/actinn-jax-benchmark/docs/figures/fig_cost_accuracy_ranges.png" id="18" name="Picture"/>
+                    <pic:cNvPicPr>
+                      <a:picLocks noChangeArrowheads="1" noChangeAspect="1"/>
+                    </pic:cNvPicPr>
+                  </pic:nvPicPr>
+                  <pic:blipFill>
+                    <a:blip r:embed="rId16"/>
+                    <a:stretch>
+                      <a:fillRect/>
+                    </a:stretch>
+                  </pic:blipFill>
+                  <pic:spPr bwMode="auto">
+                    <a:xfrm>
+                      <a:off x="0" y="0"/>
+                      <a:ext cx="5334000" cy="2668748"/>
+                    </a:xfrm>
+                    <a:prstGeom prst="rect">
+                      <a:avLst/>
+                    </a:prstGeom>
+                    <a:noFill/>
+                    <a:ln w="9525">
+                      <a:noFill/>
+                      <a:headEnd/>
+                      <a:tailEnd/>
+                    </a:ln>
+                  </pic:spPr>
+                </pic:pic>
+              </a:graphicData>
+            </a:graphic>
+          </wp:inline>
+        </w:drawing>
+      </w:r>
+    </w:p>
+    <w:p>
+      <w:pPr>
+        <w:pStyle w:val="BodyText"/>
+      </w:pPr>
+      <w:r>
+        <w:rPr>
+          <w:b/>
+          <w:bCs/>
+        </w:rPr>
+        <w:t xml:space="preserve">Figure 1.</w:t>
+      </w:r>
+      <w:r>
+        <w:t xml:space="preserve"> </w:t>
+      </w:r>
+      <w:r>
+        <w:t xml:space="preserve">Eleven methods over seven splits.</w:t>
+      </w:r>
+      <w:r>
+        <w:t xml:space="preserve"> </w:t>
+      </w:r>
+      <w:r>
+        <w:rPr>
+          <w:i/>
+          <w:iCs/>
+        </w:rPr>
+        <w:t xml:space="preserve">A:</w:t>
+      </w:r>
+      <w:r>
+        <w:t xml:space="preserve"> </w:t>
+      </w:r>
+      <w:r>
+        <w:t xml:space="preserve">accuracy as the gap to whichever method</w:t>
+      </w:r>
+      <w:r>
+        <w:t xml:space="preserve"> </w:t>
+      </w:r>
+      <w:r>
+        <w:t xml:space="preserve">leads that split — raw accuracy is dominated by split difficulty (0.94 on pbmc against 0.36 on</w:t>
+      </w:r>
+      <w:r>
+        <w:t xml:space="preserve"> </w:t>
+      </w:r>
+      <w:r>
+        <w:t xml:space="preserve">cross-dataset lung), so a range over it would measure the datasets rather than the methods;</w:t>
+      </w:r>
+      <w:r>
+        <w:t xml:space="preserve"> </w:t>
+      </w:r>
+      <w:r>
+        <w:rPr>
+          <w:rStyle w:val="VerbatimChar"/>
+        </w:rPr>
+        <w:t xml:space="preserve">leads N</w:t>
+      </w:r>
+      <w:r>
+        <w:t xml:space="preserve"> </w:t>
+      </w:r>
+      <w:r>
+        <w:t xml:space="preserve">counts splits won.</w:t>
+      </w:r>
+      <w:r>
+        <w:t xml:space="preserve"> </w:t>
+      </w:r>
+      <w:r>
+        <w:rPr>
+          <w:i/>
+          <w:iCs/>
+        </w:rPr>
+        <w:t xml:space="preserve">B:</w:t>
+      </w:r>
+      <w:r>
+        <w:t xml:space="preserve"> </w:t>
+      </w:r>
+      <w:r>
+        <w:t xml:space="preserve">fit + predict on the same splits. Diamonds are means, dots</w:t>
+      </w:r>
+      <w:r>
+        <w:t xml:space="preserve"> </w:t>
+      </w:r>
+      <w:r>
+        <w:t xml:space="preserve">the individual splits, lines run worst to best. Six methods sit within</w:t>
+      </w:r>
+      <w:r>
+        <w:t xml:space="preserve"> </w:t>
+      </w:r>
+      <w:r>
+        <w:rPr>
+          <w:b/>
+          <w:bCs/>
+        </w:rPr>
+        <w:t xml:space="preserve">0.035</w:t>
+      </w:r>
+      <w:r>
+        <w:t xml:space="preserve"> </w:t>
+      </w:r>
+      <w:r>
+        <w:t xml:space="preserve">of the</w:t>
+      </w:r>
+      <w:r>
+        <w:t xml:space="preserve"> </w:t>
+      </w:r>
+      <w:r>
+        <w:t xml:space="preserve">per-split leader while spanning 3.4 s to 57 s. Every method’s spread across splits is wider</w:t>
+      </w:r>
+      <w:r>
+        <w:t xml:space="preserve"> </w:t>
+      </w:r>
+      <w:r>
+        <w:t xml:space="preserve">than the distance between the leading methods, which is the caution that belongs with any</w:t>
+      </w:r>
+      <w:r>
+        <w:t xml:space="preserve"> </w:t>
+      </w:r>
+      <w:r>
+        <w:t xml:space="preserve">panel-mean ranking. Repeat-to-repeat variation is far smaller — five methods are exactly</w:t>
+      </w:r>
+      <w:r>
+        <w:t xml:space="preserve"> </w:t>
+      </w:r>
+      <w:r>
+        <w:t xml:space="preserve">deterministic, and only scANVI (0.056) and scArches (0.020) move more than 0.009 — so the</w:t>
+      </w:r>
+      <w:r>
+        <w:t xml:space="preserve"> </w:t>
+      </w:r>
+      <w:r>
+        <w:t xml:space="preserve">range drawn here is across datasets. Per-split detail: Supplementary Figure S11.</w:t>
       </w:r>
     </w:p>
     <w:tbl>
@@ -2379,8 +2555,8 @@
         <w:t xml:space="preserve">(Supplementary Figure S8).</w:t>
       </w:r>
     </w:p>
-    <w:bookmarkEnd w:id="16"/>
-    <w:bookmarkStart w:id="20" w:name="X80fed2e78f71a1f8f859e9647ae1a67fdba3c16"/>
+    <w:bookmarkEnd w:id="19"/>
+    <w:bookmarkStart w:id="23" w:name="X80fed2e78f71a1f8f859e9647ae1a67fdba3c16"/>
     <w:p>
       <w:pPr>
         <w:pStyle w:val="Heading2"/>
@@ -2394,7 +2570,7 @@
         <w:pStyle w:val="FirstParagraph"/>
       </w:pPr>
       <w:r>
-        <w:t xml:space="preserve">That budget buys a workflow rather than a call (Figure 1). A shipped ~800-type census</w:t>
+        <w:t xml:space="preserve">That budget buys a workflow rather than a call (Figure 2). A shipped ~800-type census</w:t>
       </w:r>
       <w:r>
         <w:t xml:space="preserve"> </w:t>
@@ -2513,18 +2689,18 @@
           <wp:inline>
             <wp:extent cx="5334000" cy="1965681"/>
             <wp:effectExtent b="0" l="0" r="0" t="0"/>
-            <wp:docPr descr="workflow" title="" id="18" name="Picture"/>
+            <wp:docPr descr="workflow" title="" id="21" name="Picture"/>
             <a:graphic>
               <a:graphicData uri="http://schemas.openxmlformats.org/drawingml/2006/picture">
                 <pic:pic>
                   <pic:nvPicPr>
-                    <pic:cNvPr descr="/Users/iandriver/Downloads/actinn-jax-benchmark/docs/figures/fig_workflow_umap_ondata.png" id="19" name="Picture"/>
+                    <pic:cNvPr descr="/Users/iandriver/Downloads/actinn-jax-benchmark/docs/figures/fig_workflow_umap_ondata.png" id="22" name="Picture"/>
                     <pic:cNvPicPr>
                       <a:picLocks noChangeArrowheads="1" noChangeAspect="1"/>
                     </pic:cNvPicPr>
                   </pic:nvPicPr>
                   <pic:blipFill>
-                    <a:blip r:embed="rId17"/>
+                    <a:blip r:embed="rId20"/>
                     <a:stretch>
                       <a:fillRect/>
                     </a:stretch>
@@ -2560,7 +2736,7 @@
           <w:b/>
           <w:bCs/>
         </w:rPr>
-        <w:t xml:space="preserve">Figure 1.</w:t>
+        <w:t xml:space="preserve">Figure 2.</w:t>
       </w:r>
       <w:r>
         <w:t xml:space="preserve"> </w:t>
@@ -2622,8 +2798,8 @@
         <w:t xml:space="preserve">, tracking the clusters. Rightmost panel is the study’s own labels.</w:t>
       </w:r>
     </w:p>
-    <w:bookmarkEnd w:id="20"/>
-    <w:bookmarkStart w:id="21" w:name="X4b2d42acec3b76f689a683a66890b5330678ad6"/>
+    <w:bookmarkEnd w:id="23"/>
+    <w:bookmarkStart w:id="24" w:name="X4b2d42acec3b76f689a683a66890b5330678ad6"/>
     <w:p>
       <w:pPr>
         <w:pStyle w:val="Heading2"/>
@@ -3010,8 +3186,8 @@
         <w:t xml:space="preserve">concordance on two withheld datasets after 17 s of CPU.</w:t>
       </w:r>
     </w:p>
-    <w:bookmarkEnd w:id="21"/>
-    <w:bookmarkStart w:id="26" w:name="X5d5a48a3482289717abb7130a8b6298d60e6610"/>
+    <w:bookmarkEnd w:id="24"/>
+    <w:bookmarkStart w:id="29" w:name="X5d5a48a3482289717abb7130a8b6298d60e6610"/>
     <w:p>
       <w:pPr>
         <w:pStyle w:val="Heading2"/>
@@ -3037,7 +3213,7 @@
         <w:t xml:space="preserve"> </w:t>
       </w:r>
       <w:r>
-        <w:t xml:space="preserve">Ontology, they partition each query by agreement (Figure 2). We ran this on three tissues:</w:t>
+        <w:t xml:space="preserve">Ontology, they partition each query by agreement (Figure 3). We ran this on three tissues:</w:t>
       </w:r>
       <w:r>
         <w:t xml:space="preserve"> </w:t>
@@ -3303,7 +3479,7 @@
       <w:r>
         <w:t xml:space="preserve"> </w:t>
       </w:r>
-      <w:hyperlink r:id="rId22">
+      <w:hyperlink r:id="rId25">
         <w:r>
           <w:rPr>
             <w:rStyle w:val="Hyperlink"/>
@@ -3400,18 +3576,18 @@
           <wp:inline>
             <wp:extent cx="5334000" cy="1663557"/>
             <wp:effectExtent b="0" l="0" r="0" t="0"/>
-            <wp:docPr descr="reference agreement" title="" id="24" name="Picture"/>
+            <wp:docPr descr="reference agreement" title="" id="27" name="Picture"/>
             <a:graphic>
               <a:graphicData uri="http://schemas.openxmlformats.org/drawingml/2006/picture">
                 <pic:pic>
                   <pic:nvPicPr>
-                    <pic:cNvPr descr="/Users/iandriver/Downloads/actinn-jax-benchmark/docs/figures/fig_consensus.png" id="25" name="Picture"/>
+                    <pic:cNvPr descr="/Users/iandriver/Downloads/actinn-jax-benchmark/docs/figures/fig_consensus.png" id="28" name="Picture"/>
                     <pic:cNvPicPr>
                       <a:picLocks noChangeArrowheads="1" noChangeAspect="1"/>
                     </pic:cNvPicPr>
                   </pic:nvPicPr>
                   <pic:blipFill>
-                    <a:blip r:embed="rId23"/>
+                    <a:blip r:embed="rId26"/>
                     <a:stretch>
                       <a:fillRect/>
                     </a:stretch>
@@ -3447,7 +3623,7 @@
           <w:b/>
           <w:bCs/>
         </w:rPr>
-        <w:t xml:space="preserve">Figure 2.</w:t>
+        <w:t xml:space="preserve">Figure 3.</w:t>
       </w:r>
       <w:r>
         <w:t xml:space="preserve"> </w:t>
@@ -3522,8 +3698,8 @@
         <w:t xml:space="preserve">is resolved.</w:t>
       </w:r>
     </w:p>
-    <w:bookmarkEnd w:id="26"/>
-    <w:bookmarkStart w:id="27" w:name="Xc9c7bad4aecd06c09d0d5feaca47a6a3c3e0f37"/>
+    <w:bookmarkEnd w:id="29"/>
+    <w:bookmarkStart w:id="30" w:name="Xc9c7bad4aecd06c09d0d5feaca47a6a3c3e0f37"/>
     <w:p>
       <w:pPr>
         <w:pStyle w:val="Heading2"/>
@@ -3630,9 +3806,9 @@
         <w:t xml:space="preserve">independently on Open Problems, where zero-shot entries sit at the bottom of the leaderboard.</w:t>
       </w:r>
     </w:p>
-    <w:bookmarkEnd w:id="27"/>
-    <w:bookmarkEnd w:id="28"/>
-    <w:bookmarkStart w:id="29" w:name="discussion"/>
+    <w:bookmarkEnd w:id="30"/>
+    <w:bookmarkEnd w:id="31"/>
+    <w:bookmarkStart w:id="32" w:name="discussion"/>
     <w:p>
       <w:pPr>
         <w:pStyle w:val="Heading1"/>
@@ -3861,8 +4037,8 @@
         <w:t xml:space="preserve">report.</w:t>
       </w:r>
     </w:p>
-    <w:bookmarkEnd w:id="29"/>
-    <w:bookmarkStart w:id="52" w:name="references"/>
+    <w:bookmarkEnd w:id="32"/>
+    <w:bookmarkStart w:id="55" w:name="references"/>
     <w:p>
       <w:pPr>
         <w:pStyle w:val="Heading1"/>
@@ -3897,7 +4073,7 @@
       <w:r>
         <w:t xml:space="preserve"> </w:t>
       </w:r>
-      <w:hyperlink r:id="rId30">
+      <w:hyperlink r:id="rId33">
         <w:r>
           <w:rPr>
             <w:rStyle w:val="Hyperlink"/>
@@ -3939,7 +4115,7 @@
       <w:r>
         <w:t xml:space="preserve"> </w:t>
       </w:r>
-      <w:hyperlink r:id="rId31">
+      <w:hyperlink r:id="rId34">
         <w:r>
           <w:rPr>
             <w:rStyle w:val="Hyperlink"/>
@@ -3981,7 +4157,7 @@
       <w:r>
         <w:t xml:space="preserve"> </w:t>
       </w:r>
-      <w:hyperlink r:id="rId32">
+      <w:hyperlink r:id="rId35">
         <w:r>
           <w:rPr>
             <w:rStyle w:val="Hyperlink"/>
@@ -4023,7 +4199,7 @@
       <w:r>
         <w:t xml:space="preserve"> </w:t>
       </w:r>
-      <w:hyperlink r:id="rId33">
+      <w:hyperlink r:id="rId36">
         <w:r>
           <w:rPr>
             <w:rStyle w:val="Hyperlink"/>
@@ -4049,7 +4225,7 @@
       <w:r>
         <w:t xml:space="preserve"> </w:t>
       </w:r>
-      <w:hyperlink r:id="rId34">
+      <w:hyperlink r:id="rId37">
         <w:r>
           <w:rPr>
             <w:rStyle w:val="Hyperlink"/>
@@ -4117,7 +4293,7 @@
       <w:r>
         <w:t xml:space="preserve"> </w:t>
       </w:r>
-      <w:hyperlink r:id="rId35">
+      <w:hyperlink r:id="rId38">
         <w:r>
           <w:rPr>
             <w:rStyle w:val="Hyperlink"/>
@@ -4159,7 +4335,7 @@
       <w:r>
         <w:t xml:space="preserve"> </w:t>
       </w:r>
-      <w:hyperlink r:id="rId36">
+      <w:hyperlink r:id="rId39">
         <w:r>
           <w:rPr>
             <w:rStyle w:val="Hyperlink"/>
@@ -4201,7 +4377,7 @@
       <w:r>
         <w:t xml:space="preserve"> </w:t>
       </w:r>
-      <w:hyperlink r:id="rId37">
+      <w:hyperlink r:id="rId40">
         <w:r>
           <w:rPr>
             <w:rStyle w:val="Hyperlink"/>
@@ -4243,7 +4419,7 @@
       <w:r>
         <w:t xml:space="preserve"> </w:t>
       </w:r>
-      <w:hyperlink r:id="rId38">
+      <w:hyperlink r:id="rId41">
         <w:r>
           <w:rPr>
             <w:rStyle w:val="Hyperlink"/>
@@ -4285,7 +4461,7 @@
       <w:r>
         <w:t xml:space="preserve"> </w:t>
       </w:r>
-      <w:hyperlink r:id="rId39">
+      <w:hyperlink r:id="rId42">
         <w:r>
           <w:rPr>
             <w:rStyle w:val="Hyperlink"/>
@@ -4369,7 +4545,7 @@
       <w:r>
         <w:t xml:space="preserve"> </w:t>
       </w:r>
-      <w:hyperlink r:id="rId40">
+      <w:hyperlink r:id="rId43">
         <w:r>
           <w:rPr>
             <w:rStyle w:val="Hyperlink"/>
@@ -4411,7 +4587,7 @@
       <w:r>
         <w:t xml:space="preserve"> </w:t>
       </w:r>
-      <w:hyperlink r:id="rId41">
+      <w:hyperlink r:id="rId44">
         <w:r>
           <w:rPr>
             <w:rStyle w:val="Hyperlink"/>
@@ -4453,7 +4629,7 @@
       <w:r>
         <w:t xml:space="preserve"> </w:t>
       </w:r>
-      <w:hyperlink r:id="rId42">
+      <w:hyperlink r:id="rId45">
         <w:r>
           <w:rPr>
             <w:rStyle w:val="Hyperlink"/>
@@ -4537,7 +4713,7 @@
       <w:r>
         <w:t xml:space="preserve"> </w:t>
       </w:r>
-      <w:hyperlink r:id="rId22">
+      <w:hyperlink r:id="rId25">
         <w:r>
           <w:rPr>
             <w:rStyle w:val="Hyperlink"/>
@@ -4563,7 +4739,7 @@
       <w:r>
         <w:t xml:space="preserve"> </w:t>
       </w:r>
-      <w:hyperlink r:id="rId43">
+      <w:hyperlink r:id="rId46">
         <w:r>
           <w:rPr>
             <w:rStyle w:val="Hyperlink"/>
@@ -4605,7 +4781,7 @@
       <w:r>
         <w:t xml:space="preserve"> </w:t>
       </w:r>
-      <w:hyperlink r:id="rId44">
+      <w:hyperlink r:id="rId47">
         <w:r>
           <w:rPr>
             <w:rStyle w:val="Hyperlink"/>
@@ -4647,7 +4823,7 @@
       <w:r>
         <w:t xml:space="preserve"> </w:t>
       </w:r>
-      <w:hyperlink r:id="rId45">
+      <w:hyperlink r:id="rId48">
         <w:r>
           <w:rPr>
             <w:rStyle w:val="Hyperlink"/>
@@ -4731,7 +4907,7 @@
       <w:r>
         <w:t xml:space="preserve"> </w:t>
       </w:r>
-      <w:hyperlink r:id="rId46">
+      <w:hyperlink r:id="rId49">
         <w:r>
           <w:rPr>
             <w:rStyle w:val="Hyperlink"/>
@@ -4773,7 +4949,7 @@
       <w:r>
         <w:t xml:space="preserve"> </w:t>
       </w:r>
-      <w:hyperlink r:id="rId47">
+      <w:hyperlink r:id="rId50">
         <w:r>
           <w:rPr>
             <w:rStyle w:val="Hyperlink"/>
@@ -4815,7 +4991,7 @@
       <w:r>
         <w:t xml:space="preserve"> </w:t>
       </w:r>
-      <w:hyperlink r:id="rId48">
+      <w:hyperlink r:id="rId51">
         <w:r>
           <w:rPr>
             <w:rStyle w:val="Hyperlink"/>
@@ -4857,7 +5033,7 @@
       <w:r>
         <w:t xml:space="preserve"> </w:t>
       </w:r>
-      <w:hyperlink r:id="rId49">
+      <w:hyperlink r:id="rId52">
         <w:r>
           <w:rPr>
             <w:rStyle w:val="Hyperlink"/>
@@ -4899,7 +5075,7 @@
       <w:r>
         <w:t xml:space="preserve"> </w:t>
       </w:r>
-      <w:hyperlink r:id="rId50">
+      <w:hyperlink r:id="rId53">
         <w:r>
           <w:rPr>
             <w:rStyle w:val="Hyperlink"/>
@@ -4941,7 +5117,7 @@
       <w:r>
         <w:t xml:space="preserve"> </w:t>
       </w:r>
-      <w:hyperlink r:id="rId51">
+      <w:hyperlink r:id="rId54">
         <w:r>
           <w:rPr>
             <w:rStyle w:val="Hyperlink"/>
@@ -4953,7 +5129,7 @@
         <w:t xml:space="preserve">.</w:t>
       </w:r>
     </w:p>
-    <w:bookmarkEnd w:id="52"/>
+    <w:bookmarkEnd w:id="55"/>
     <w:sectPr>
       <w:footnotePr>
         <w:numRestart w:val="eachSect"/>

</xml_diff>